<commit_message>
Template updates for consistency.
</commit_message>
<xml_diff>
--- a/templates/docx_templates/module_activity_sheet_master.docx
+++ b/templates/docx_templates/module_activity_sheet_master.docx
@@ -90,12 +90,16 @@
         <w:ind w:left="179"/>
         <w:rPr>
           <w:rFonts w:ascii="Segoe UI" w:hAnsi="Segoe UI" w:cs="Segoe UI"/>
+          <w:b/>
+          <w:bCs/>
           <w:sz w:val="28"/>
         </w:rPr>
       </w:pPr>
       <w:r>
         <w:rPr>
           <w:rFonts w:ascii="Segoe UI" w:hAnsi="Segoe UI" w:cs="Segoe UI"/>
+          <w:b/>
+          <w:bCs/>
           <w:sz w:val="28"/>
         </w:rPr>
         <w:t>Module</w:t>
@@ -103,6 +107,8 @@
       <w:r>
         <w:rPr>
           <w:rFonts w:ascii="Segoe UI" w:hAnsi="Segoe UI" w:cs="Segoe UI"/>
+          <w:b/>
+          <w:bCs/>
           <w:spacing w:val="-9"/>
           <w:sz w:val="28"/>
         </w:rPr>
@@ -111,6 +117,8 @@
       <w:r>
         <w:rPr>
           <w:rFonts w:ascii="Segoe UI" w:hAnsi="Segoe UI" w:cs="Segoe UI"/>
+          <w:b/>
+          <w:bCs/>
           <w:sz w:val="28"/>
         </w:rPr>
         <w:t>Activity</w:t>
@@ -118,6 +126,8 @@
       <w:r>
         <w:rPr>
           <w:rFonts w:ascii="Segoe UI" w:hAnsi="Segoe UI" w:cs="Segoe UI"/>
+          <w:b/>
+          <w:bCs/>
           <w:spacing w:val="-9"/>
           <w:sz w:val="28"/>
         </w:rPr>
@@ -126,6 +136,8 @@
       <w:r>
         <w:rPr>
           <w:rFonts w:ascii="Segoe UI" w:hAnsi="Segoe UI" w:cs="Segoe UI"/>
+          <w:b/>
+          <w:bCs/>
           <w:spacing w:val="-2"/>
           <w:sz w:val="28"/>
         </w:rPr>
@@ -352,15 +364,15 @@
                 <w:rFonts w:ascii="Times New Roman" w:hAnsi="Times New Roman" w:cs="Times New Roman"/>
                 <w:b/>
                 <w:bCs/>
-                <w:sz w:val="24"/>
-              </w:rPr>
-            </w:pPr>
-            <w:r>
-              <w:rPr>
-                <w:rFonts w:ascii="Times New Roman" w:hAnsi="Times New Roman" w:cs="Times New Roman"/>
-                <w:b/>
-                <w:bCs/>
-                <w:sz w:val="24"/>
+                <w:szCs w:val="21"/>
+              </w:rPr>
+            </w:pPr>
+            <w:r>
+              <w:rPr>
+                <w:rFonts w:ascii="Times New Roman" w:hAnsi="Times New Roman" w:cs="Times New Roman"/>
+                <w:b/>
+                <w:bCs/>
+                <w:szCs w:val="21"/>
               </w:rPr>
               <w:t>Pre-</w:t>
             </w:r>
@@ -370,7 +382,7 @@
                 <w:b/>
                 <w:bCs/>
                 <w:spacing w:val="-4"/>
-                <w:sz w:val="24"/>
+                <w:szCs w:val="21"/>
               </w:rPr>
               <w:t>Test</w:t>
             </w:r>
@@ -381,27 +393,27 @@
               <w:spacing w:before="0" w:line="306" w:lineRule="exact"/>
               <w:rPr>
                 <w:rFonts w:ascii="Times New Roman" w:hAnsi="Times New Roman" w:cs="Times New Roman"/>
-                <w:sz w:val="24"/>
-              </w:rPr>
-            </w:pPr>
-            <w:r>
-              <w:rPr>
-                <w:rFonts w:ascii="Times New Roman" w:hAnsi="Times New Roman" w:cs="Times New Roman"/>
-                <w:sz w:val="24"/>
+                <w:szCs w:val="21"/>
+              </w:rPr>
+            </w:pPr>
+            <w:r>
+              <w:rPr>
+                <w:rFonts w:ascii="Times New Roman" w:hAnsi="Times New Roman" w:cs="Times New Roman"/>
+                <w:szCs w:val="21"/>
               </w:rPr>
               <w:t>{% if session</w:t>
             </w:r>
             <w:r>
               <w:rPr>
                 <w:rFonts w:ascii="Times New Roman" w:hAnsi="Times New Roman" w:cs="Times New Roman"/>
-                <w:sz w:val="24"/>
+                <w:szCs w:val="21"/>
               </w:rPr>
               <w:t>1</w:t>
             </w:r>
             <w:r>
               <w:rPr>
                 <w:rFonts w:ascii="Times New Roman" w:hAnsi="Times New Roman" w:cs="Times New Roman"/>
-                <w:sz w:val="24"/>
+                <w:szCs w:val="21"/>
               </w:rPr>
               <w:t>.is_pba %}</w:t>
             </w:r>
@@ -410,56 +422,56 @@
                 <w:rFonts w:ascii="Times New Roman" w:hAnsi="Times New Roman" w:cs="Times New Roman"/>
                 <w:b/>
                 <w:bCs/>
-                <w:sz w:val="24"/>
+                <w:szCs w:val="21"/>
               </w:rPr>
               <w:t>PBA:</w:t>
             </w:r>
             <w:r>
               <w:rPr>
                 <w:rFonts w:ascii="Times New Roman" w:hAnsi="Times New Roman" w:cs="Times New Roman"/>
-                <w:sz w:val="24"/>
+                <w:szCs w:val="21"/>
               </w:rPr>
               <w:t xml:space="preserve"> </w:t>
             </w:r>
             <w:r>
               <w:rPr>
                 <w:rFonts w:ascii="Times New Roman" w:hAnsi="Times New Roman" w:cs="Times New Roman"/>
-                <w:sz w:val="24"/>
+                <w:szCs w:val="21"/>
               </w:rPr>
               <w:t>{% endif %}</w:t>
             </w:r>
             <w:r>
               <w:rPr>
                 <w:rFonts w:ascii="Times New Roman" w:hAnsi="Times New Roman" w:cs="Times New Roman"/>
-                <w:sz w:val="24"/>
+                <w:szCs w:val="21"/>
               </w:rPr>
               <w:t>{{</w:t>
             </w:r>
             <w:r>
               <w:rPr>
                 <w:rFonts w:ascii="Times New Roman" w:hAnsi="Times New Roman" w:cs="Times New Roman"/>
-                <w:sz w:val="24"/>
+                <w:szCs w:val="21"/>
               </w:rPr>
               <w:t xml:space="preserve"> </w:t>
             </w:r>
             <w:r>
               <w:rPr>
                 <w:rFonts w:ascii="Times New Roman" w:hAnsi="Times New Roman" w:cs="Times New Roman"/>
-                <w:sz w:val="24"/>
+                <w:szCs w:val="21"/>
               </w:rPr>
               <w:t>session</w:t>
             </w:r>
             <w:r>
               <w:rPr>
                 <w:rFonts w:ascii="Times New Roman" w:hAnsi="Times New Roman" w:cs="Times New Roman"/>
-                <w:sz w:val="24"/>
+                <w:szCs w:val="21"/>
               </w:rPr>
               <w:t>1</w:t>
             </w:r>
             <w:r>
               <w:rPr>
                 <w:rFonts w:ascii="Times New Roman" w:hAnsi="Times New Roman" w:cs="Times New Roman"/>
-                <w:sz w:val="24"/>
+                <w:szCs w:val="21"/>
               </w:rPr>
               <w:t>.activity }}</w:t>
             </w:r>
@@ -476,7 +488,7 @@
               <w:ind w:left="0"/>
               <w:rPr>
                 <w:rFonts w:ascii="Times New Roman" w:hAnsi="Times New Roman" w:cs="Times New Roman"/>
-                <w:sz w:val="24"/>
+                <w:szCs w:val="21"/>
               </w:rPr>
             </w:pPr>
           </w:p>
@@ -498,8 +510,7 @@
             <w:pPr>
               <w:rPr>
                 <w:rFonts w:ascii="Times New Roman" w:hAnsi="Times New Roman" w:cs="Times New Roman"/>
-                <w:sz w:val="2"/>
-                <w:szCs w:val="2"/>
+                <w:szCs w:val="21"/>
               </w:rPr>
             </w:pPr>
           </w:p>
@@ -515,14 +526,14 @@
               <w:spacing w:line="306" w:lineRule="exact"/>
               <w:rPr>
                 <w:rFonts w:ascii="Times New Roman" w:hAnsi="Times New Roman" w:cs="Times New Roman"/>
-                <w:sz w:val="24"/>
+                <w:szCs w:val="21"/>
               </w:rPr>
             </w:pPr>
             <w:r>
               <w:rPr>
                 <w:rFonts w:ascii="Times New Roman" w:hAnsi="Times New Roman" w:cs="Times New Roman"/>
                 <w:spacing w:val="-5"/>
-                <w:sz w:val="24"/>
+                <w:szCs w:val="21"/>
               </w:rPr>
               <w:t>{% if session</w:t>
             </w:r>
@@ -530,7 +541,7 @@
               <w:rPr>
                 <w:rFonts w:ascii="Times New Roman" w:hAnsi="Times New Roman" w:cs="Times New Roman"/>
                 <w:spacing w:val="-5"/>
-                <w:sz w:val="24"/>
+                <w:szCs w:val="21"/>
               </w:rPr>
               <w:t>1</w:t>
             </w:r>
@@ -538,7 +549,7 @@
               <w:rPr>
                 <w:rFonts w:ascii="Times New Roman" w:hAnsi="Times New Roman" w:cs="Times New Roman"/>
                 <w:spacing w:val="-5"/>
-                <w:sz w:val="24"/>
+                <w:szCs w:val="21"/>
               </w:rPr>
               <w:t>.has_pba %}{% else %}N/A{% endif %}</w:t>
             </w:r>
@@ -673,7 +684,7 @@
                 <w:rFonts w:ascii="Times New Roman" w:hAnsi="Times New Roman" w:cs="Times New Roman"/>
                 <w:b/>
                 <w:bCs/>
-                <w:sz w:val="24"/>
+                <w:szCs w:val="21"/>
               </w:rPr>
             </w:pPr>
             <w:r>
@@ -682,7 +693,7 @@
                 <w:b/>
                 <w:bCs/>
                 <w:spacing w:val="-5"/>
-                <w:sz w:val="24"/>
+                <w:szCs w:val="21"/>
               </w:rPr>
               <w:t>RCA</w:t>
             </w:r>
@@ -693,27 +704,27 @@
               <w:spacing w:before="0" w:line="306" w:lineRule="exact"/>
               <w:rPr>
                 <w:rFonts w:ascii="Times New Roman" w:hAnsi="Times New Roman" w:cs="Times New Roman"/>
-                <w:sz w:val="24"/>
-              </w:rPr>
-            </w:pPr>
-            <w:r>
-              <w:rPr>
-                <w:rFonts w:ascii="Times New Roman" w:hAnsi="Times New Roman" w:cs="Times New Roman"/>
-                <w:sz w:val="24"/>
+                <w:szCs w:val="21"/>
+              </w:rPr>
+            </w:pPr>
+            <w:r>
+              <w:rPr>
+                <w:rFonts w:ascii="Times New Roman" w:hAnsi="Times New Roman" w:cs="Times New Roman"/>
+                <w:szCs w:val="21"/>
               </w:rPr>
               <w:t>{% if session</w:t>
             </w:r>
             <w:r>
               <w:rPr>
                 <w:rFonts w:ascii="Times New Roman" w:hAnsi="Times New Roman" w:cs="Times New Roman"/>
-                <w:sz w:val="24"/>
+                <w:szCs w:val="21"/>
               </w:rPr>
               <w:t>2</w:t>
             </w:r>
             <w:r>
               <w:rPr>
                 <w:rFonts w:ascii="Times New Roman" w:hAnsi="Times New Roman" w:cs="Times New Roman"/>
-                <w:sz w:val="24"/>
+                <w:szCs w:val="21"/>
               </w:rPr>
               <w:t>.is_pba %}</w:t>
             </w:r>
@@ -722,42 +733,42 @@
                 <w:rFonts w:ascii="Times New Roman" w:hAnsi="Times New Roman" w:cs="Times New Roman"/>
                 <w:b/>
                 <w:bCs/>
-                <w:sz w:val="24"/>
+                <w:szCs w:val="21"/>
               </w:rPr>
               <w:t>PBA:</w:t>
             </w:r>
             <w:r>
               <w:rPr>
                 <w:rFonts w:ascii="Times New Roman" w:hAnsi="Times New Roman" w:cs="Times New Roman"/>
-                <w:sz w:val="24"/>
+                <w:szCs w:val="21"/>
               </w:rPr>
               <w:t xml:space="preserve"> {% endif %}{{</w:t>
             </w:r>
             <w:r>
               <w:rPr>
                 <w:rFonts w:ascii="Times New Roman" w:hAnsi="Times New Roman" w:cs="Times New Roman"/>
-                <w:sz w:val="24"/>
+                <w:szCs w:val="21"/>
               </w:rPr>
               <w:t xml:space="preserve"> </w:t>
             </w:r>
             <w:r>
               <w:rPr>
                 <w:rFonts w:ascii="Times New Roman" w:hAnsi="Times New Roman" w:cs="Times New Roman"/>
-                <w:sz w:val="24"/>
+                <w:szCs w:val="21"/>
               </w:rPr>
               <w:t>session</w:t>
             </w:r>
             <w:r>
               <w:rPr>
                 <w:rFonts w:ascii="Times New Roman" w:hAnsi="Times New Roman" w:cs="Times New Roman"/>
-                <w:sz w:val="24"/>
+                <w:szCs w:val="21"/>
               </w:rPr>
               <w:t>2</w:t>
             </w:r>
             <w:r>
               <w:rPr>
                 <w:rFonts w:ascii="Times New Roman" w:hAnsi="Times New Roman" w:cs="Times New Roman"/>
-                <w:sz w:val="24"/>
+                <w:szCs w:val="21"/>
               </w:rPr>
               <w:t>.activity }}</w:t>
             </w:r>
@@ -774,7 +785,7 @@
               <w:ind w:left="0"/>
               <w:rPr>
                 <w:rFonts w:ascii="Times New Roman" w:hAnsi="Times New Roman" w:cs="Times New Roman"/>
-                <w:sz w:val="24"/>
+                <w:szCs w:val="21"/>
               </w:rPr>
             </w:pPr>
           </w:p>
@@ -796,8 +807,7 @@
             <w:pPr>
               <w:rPr>
                 <w:rFonts w:ascii="Times New Roman" w:hAnsi="Times New Roman" w:cs="Times New Roman"/>
-                <w:sz w:val="2"/>
-                <w:szCs w:val="2"/>
+                <w:szCs w:val="21"/>
               </w:rPr>
             </w:pPr>
           </w:p>
@@ -813,14 +823,14 @@
               <w:spacing w:line="306" w:lineRule="exact"/>
               <w:rPr>
                 <w:rFonts w:ascii="Times New Roman" w:hAnsi="Times New Roman" w:cs="Times New Roman"/>
-                <w:sz w:val="24"/>
+                <w:szCs w:val="21"/>
               </w:rPr>
             </w:pPr>
             <w:r>
               <w:rPr>
                 <w:rFonts w:ascii="Times New Roman" w:hAnsi="Times New Roman" w:cs="Times New Roman"/>
                 <w:spacing w:val="-5"/>
-                <w:sz w:val="24"/>
+                <w:szCs w:val="21"/>
               </w:rPr>
               <w:t>{% if session</w:t>
             </w:r>
@@ -828,7 +838,7 @@
               <w:rPr>
                 <w:rFonts w:ascii="Times New Roman" w:hAnsi="Times New Roman" w:cs="Times New Roman"/>
                 <w:spacing w:val="-5"/>
-                <w:sz w:val="24"/>
+                <w:szCs w:val="21"/>
               </w:rPr>
               <w:t>2</w:t>
             </w:r>
@@ -836,7 +846,7 @@
               <w:rPr>
                 <w:rFonts w:ascii="Times New Roman" w:hAnsi="Times New Roman" w:cs="Times New Roman"/>
                 <w:spacing w:val="-5"/>
-                <w:sz w:val="24"/>
+                <w:szCs w:val="21"/>
               </w:rPr>
               <w:t>.has_pba %}{% else %}N/A{% endif %}</w:t>
             </w:r>
@@ -972,7 +982,7 @@
                 <w:rFonts w:ascii="Times New Roman" w:hAnsi="Times New Roman" w:cs="Times New Roman"/>
                 <w:b/>
                 <w:bCs/>
-                <w:sz w:val="24"/>
+                <w:szCs w:val="21"/>
               </w:rPr>
             </w:pPr>
             <w:r>
@@ -981,7 +991,7 @@
                 <w:b/>
                 <w:bCs/>
                 <w:spacing w:val="-5"/>
-                <w:sz w:val="24"/>
+                <w:szCs w:val="21"/>
               </w:rPr>
               <w:t>RCA</w:t>
             </w:r>
@@ -992,27 +1002,27 @@
               <w:spacing w:before="0" w:line="306" w:lineRule="exact"/>
               <w:rPr>
                 <w:rFonts w:ascii="Times New Roman" w:hAnsi="Times New Roman" w:cs="Times New Roman"/>
-                <w:sz w:val="24"/>
-              </w:rPr>
-            </w:pPr>
-            <w:r>
-              <w:rPr>
-                <w:rFonts w:ascii="Times New Roman" w:hAnsi="Times New Roman" w:cs="Times New Roman"/>
-                <w:sz w:val="24"/>
+                <w:szCs w:val="21"/>
+              </w:rPr>
+            </w:pPr>
+            <w:r>
+              <w:rPr>
+                <w:rFonts w:ascii="Times New Roman" w:hAnsi="Times New Roman" w:cs="Times New Roman"/>
+                <w:szCs w:val="21"/>
               </w:rPr>
               <w:t>{% if session</w:t>
             </w:r>
             <w:r>
               <w:rPr>
                 <w:rFonts w:ascii="Times New Roman" w:hAnsi="Times New Roman" w:cs="Times New Roman"/>
-                <w:sz w:val="24"/>
+                <w:szCs w:val="21"/>
               </w:rPr>
               <w:t>3</w:t>
             </w:r>
             <w:r>
               <w:rPr>
                 <w:rFonts w:ascii="Times New Roman" w:hAnsi="Times New Roman" w:cs="Times New Roman"/>
-                <w:sz w:val="24"/>
+                <w:szCs w:val="21"/>
               </w:rPr>
               <w:t>.is_pba %}</w:t>
             </w:r>
@@ -1021,42 +1031,42 @@
                 <w:rFonts w:ascii="Times New Roman" w:hAnsi="Times New Roman" w:cs="Times New Roman"/>
                 <w:b/>
                 <w:bCs/>
-                <w:sz w:val="24"/>
+                <w:szCs w:val="21"/>
               </w:rPr>
               <w:t>PBA:</w:t>
             </w:r>
             <w:r>
               <w:rPr>
                 <w:rFonts w:ascii="Times New Roman" w:hAnsi="Times New Roman" w:cs="Times New Roman"/>
-                <w:sz w:val="24"/>
+                <w:szCs w:val="21"/>
               </w:rPr>
               <w:t xml:space="preserve"> {% endif %}{{</w:t>
             </w:r>
             <w:r>
               <w:rPr>
                 <w:rFonts w:ascii="Times New Roman" w:hAnsi="Times New Roman" w:cs="Times New Roman"/>
-                <w:sz w:val="24"/>
+                <w:szCs w:val="21"/>
               </w:rPr>
               <w:t xml:space="preserve"> </w:t>
             </w:r>
             <w:r>
               <w:rPr>
                 <w:rFonts w:ascii="Times New Roman" w:hAnsi="Times New Roman" w:cs="Times New Roman"/>
-                <w:sz w:val="24"/>
+                <w:szCs w:val="21"/>
               </w:rPr>
               <w:t>session</w:t>
             </w:r>
             <w:r>
               <w:rPr>
                 <w:rFonts w:ascii="Times New Roman" w:hAnsi="Times New Roman" w:cs="Times New Roman"/>
-                <w:sz w:val="24"/>
+                <w:szCs w:val="21"/>
               </w:rPr>
               <w:t>3</w:t>
             </w:r>
             <w:r>
               <w:rPr>
                 <w:rFonts w:ascii="Times New Roman" w:hAnsi="Times New Roman" w:cs="Times New Roman"/>
-                <w:sz w:val="24"/>
+                <w:szCs w:val="21"/>
               </w:rPr>
               <w:t>.activity }}</w:t>
             </w:r>
@@ -1073,7 +1083,7 @@
               <w:ind w:left="0"/>
               <w:rPr>
                 <w:rFonts w:ascii="Times New Roman" w:hAnsi="Times New Roman" w:cs="Times New Roman"/>
-                <w:sz w:val="24"/>
+                <w:szCs w:val="21"/>
               </w:rPr>
             </w:pPr>
           </w:p>
@@ -1095,8 +1105,7 @@
             <w:pPr>
               <w:rPr>
                 <w:rFonts w:ascii="Times New Roman" w:hAnsi="Times New Roman" w:cs="Times New Roman"/>
-                <w:sz w:val="2"/>
-                <w:szCs w:val="2"/>
+                <w:szCs w:val="21"/>
               </w:rPr>
             </w:pPr>
           </w:p>
@@ -1112,14 +1121,14 @@
               <w:spacing w:line="306" w:lineRule="exact"/>
               <w:rPr>
                 <w:rFonts w:ascii="Times New Roman" w:hAnsi="Times New Roman" w:cs="Times New Roman"/>
-                <w:sz w:val="24"/>
+                <w:szCs w:val="21"/>
               </w:rPr>
             </w:pPr>
             <w:r>
               <w:rPr>
                 <w:rFonts w:ascii="Times New Roman" w:hAnsi="Times New Roman" w:cs="Times New Roman"/>
                 <w:spacing w:val="-5"/>
-                <w:sz w:val="24"/>
+                <w:szCs w:val="21"/>
               </w:rPr>
               <w:t>{% if session</w:t>
             </w:r>
@@ -1127,7 +1136,7 @@
               <w:rPr>
                 <w:rFonts w:ascii="Times New Roman" w:hAnsi="Times New Roman" w:cs="Times New Roman"/>
                 <w:spacing w:val="-5"/>
-                <w:sz w:val="24"/>
+                <w:szCs w:val="21"/>
               </w:rPr>
               <w:t>3</w:t>
             </w:r>
@@ -1135,7 +1144,7 @@
               <w:rPr>
                 <w:rFonts w:ascii="Times New Roman" w:hAnsi="Times New Roman" w:cs="Times New Roman"/>
                 <w:spacing w:val="-5"/>
-                <w:sz w:val="24"/>
+                <w:szCs w:val="21"/>
               </w:rPr>
               <w:t>.has_pba %}{% else %}N/A{% endif %}</w:t>
             </w:r>
@@ -1270,7 +1279,7 @@
                 <w:rFonts w:ascii="Times New Roman" w:hAnsi="Times New Roman" w:cs="Times New Roman"/>
                 <w:b/>
                 <w:bCs/>
-                <w:sz w:val="24"/>
+                <w:szCs w:val="21"/>
               </w:rPr>
             </w:pPr>
             <w:r>
@@ -1279,7 +1288,7 @@
                 <w:b/>
                 <w:bCs/>
                 <w:spacing w:val="-5"/>
-                <w:sz w:val="24"/>
+                <w:szCs w:val="21"/>
               </w:rPr>
               <w:t>RCA</w:t>
             </w:r>
@@ -1290,27 +1299,27 @@
               <w:spacing w:before="0" w:line="306" w:lineRule="exact"/>
               <w:rPr>
                 <w:rFonts w:ascii="Times New Roman" w:hAnsi="Times New Roman" w:cs="Times New Roman"/>
-                <w:sz w:val="24"/>
-              </w:rPr>
-            </w:pPr>
-            <w:r>
-              <w:rPr>
-                <w:rFonts w:ascii="Times New Roman" w:hAnsi="Times New Roman" w:cs="Times New Roman"/>
-                <w:sz w:val="24"/>
+                <w:szCs w:val="21"/>
+              </w:rPr>
+            </w:pPr>
+            <w:r>
+              <w:rPr>
+                <w:rFonts w:ascii="Times New Roman" w:hAnsi="Times New Roman" w:cs="Times New Roman"/>
+                <w:szCs w:val="21"/>
               </w:rPr>
               <w:t>{% if session</w:t>
             </w:r>
             <w:r>
               <w:rPr>
                 <w:rFonts w:ascii="Times New Roman" w:hAnsi="Times New Roman" w:cs="Times New Roman"/>
-                <w:sz w:val="24"/>
+                <w:szCs w:val="21"/>
               </w:rPr>
               <w:t>4</w:t>
             </w:r>
             <w:r>
               <w:rPr>
                 <w:rFonts w:ascii="Times New Roman" w:hAnsi="Times New Roman" w:cs="Times New Roman"/>
-                <w:sz w:val="24"/>
+                <w:szCs w:val="21"/>
               </w:rPr>
               <w:t>.is_pba %}</w:t>
             </w:r>
@@ -1319,42 +1328,42 @@
                 <w:rFonts w:ascii="Times New Roman" w:hAnsi="Times New Roman" w:cs="Times New Roman"/>
                 <w:b/>
                 <w:bCs/>
-                <w:sz w:val="24"/>
+                <w:szCs w:val="21"/>
               </w:rPr>
               <w:t>PBA:</w:t>
             </w:r>
             <w:r>
               <w:rPr>
                 <w:rFonts w:ascii="Times New Roman" w:hAnsi="Times New Roman" w:cs="Times New Roman"/>
-                <w:sz w:val="24"/>
+                <w:szCs w:val="21"/>
               </w:rPr>
               <w:t xml:space="preserve"> {% endif %}{{</w:t>
             </w:r>
             <w:r>
               <w:rPr>
                 <w:rFonts w:ascii="Times New Roman" w:hAnsi="Times New Roman" w:cs="Times New Roman"/>
-                <w:sz w:val="24"/>
+                <w:szCs w:val="21"/>
               </w:rPr>
               <w:t xml:space="preserve"> </w:t>
             </w:r>
             <w:r>
               <w:rPr>
                 <w:rFonts w:ascii="Times New Roman" w:hAnsi="Times New Roman" w:cs="Times New Roman"/>
-                <w:sz w:val="24"/>
+                <w:szCs w:val="21"/>
               </w:rPr>
               <w:t>session</w:t>
             </w:r>
             <w:r>
               <w:rPr>
                 <w:rFonts w:ascii="Times New Roman" w:hAnsi="Times New Roman" w:cs="Times New Roman"/>
-                <w:sz w:val="24"/>
+                <w:szCs w:val="21"/>
               </w:rPr>
               <w:t>4</w:t>
             </w:r>
             <w:r>
               <w:rPr>
                 <w:rFonts w:ascii="Times New Roman" w:hAnsi="Times New Roman" w:cs="Times New Roman"/>
-                <w:sz w:val="24"/>
+                <w:szCs w:val="21"/>
               </w:rPr>
               <w:t>.activity }}</w:t>
             </w:r>
@@ -1371,7 +1380,7 @@
               <w:ind w:left="0"/>
               <w:rPr>
                 <w:rFonts w:ascii="Times New Roman" w:hAnsi="Times New Roman" w:cs="Times New Roman"/>
-                <w:sz w:val="24"/>
+                <w:szCs w:val="21"/>
               </w:rPr>
             </w:pPr>
           </w:p>
@@ -1393,8 +1402,7 @@
             <w:pPr>
               <w:rPr>
                 <w:rFonts w:ascii="Times New Roman" w:hAnsi="Times New Roman" w:cs="Times New Roman"/>
-                <w:sz w:val="2"/>
-                <w:szCs w:val="2"/>
+                <w:szCs w:val="21"/>
               </w:rPr>
             </w:pPr>
           </w:p>
@@ -1411,14 +1419,14 @@
               <w:ind w:left="72"/>
               <w:rPr>
                 <w:rFonts w:ascii="Times New Roman" w:hAnsi="Times New Roman" w:cs="Times New Roman"/>
-                <w:sz w:val="24"/>
+                <w:szCs w:val="21"/>
               </w:rPr>
             </w:pPr>
             <w:r>
               <w:rPr>
                 <w:rFonts w:ascii="Times New Roman" w:hAnsi="Times New Roman" w:cs="Times New Roman"/>
                 <w:spacing w:val="-5"/>
-                <w:sz w:val="24"/>
+                <w:szCs w:val="21"/>
               </w:rPr>
               <w:t>{% if session</w:t>
             </w:r>
@@ -1426,7 +1434,7 @@
               <w:rPr>
                 <w:rFonts w:ascii="Times New Roman" w:hAnsi="Times New Roman" w:cs="Times New Roman"/>
                 <w:spacing w:val="-5"/>
-                <w:sz w:val="24"/>
+                <w:szCs w:val="21"/>
               </w:rPr>
               <w:t>4</w:t>
             </w:r>
@@ -1434,7 +1442,7 @@
               <w:rPr>
                 <w:rFonts w:ascii="Times New Roman" w:hAnsi="Times New Roman" w:cs="Times New Roman"/>
                 <w:spacing w:val="-5"/>
-                <w:sz w:val="24"/>
+                <w:szCs w:val="21"/>
               </w:rPr>
               <w:t>.has_pba %}{% else %}N/A{% endif %}</w:t>
             </w:r>
@@ -1570,7 +1578,7 @@
                 <w:rFonts w:ascii="Times New Roman" w:hAnsi="Times New Roman" w:cs="Times New Roman"/>
                 <w:b/>
                 <w:bCs/>
-                <w:sz w:val="24"/>
+                <w:szCs w:val="21"/>
               </w:rPr>
             </w:pPr>
             <w:r>
@@ -1579,7 +1587,7 @@
                 <w:b/>
                 <w:bCs/>
                 <w:spacing w:val="-5"/>
-                <w:sz w:val="24"/>
+                <w:szCs w:val="21"/>
               </w:rPr>
               <w:t>RCA</w:t>
             </w:r>
@@ -1590,27 +1598,27 @@
               <w:spacing w:before="0" w:line="306" w:lineRule="exact"/>
               <w:rPr>
                 <w:rFonts w:ascii="Times New Roman" w:hAnsi="Times New Roman" w:cs="Times New Roman"/>
-                <w:sz w:val="24"/>
-              </w:rPr>
-            </w:pPr>
-            <w:r>
-              <w:rPr>
-                <w:rFonts w:ascii="Times New Roman" w:hAnsi="Times New Roman" w:cs="Times New Roman"/>
-                <w:sz w:val="24"/>
+                <w:szCs w:val="21"/>
+              </w:rPr>
+            </w:pPr>
+            <w:r>
+              <w:rPr>
+                <w:rFonts w:ascii="Times New Roman" w:hAnsi="Times New Roman" w:cs="Times New Roman"/>
+                <w:szCs w:val="21"/>
               </w:rPr>
               <w:t>{% if session</w:t>
             </w:r>
             <w:r>
               <w:rPr>
                 <w:rFonts w:ascii="Times New Roman" w:hAnsi="Times New Roman" w:cs="Times New Roman"/>
-                <w:sz w:val="24"/>
+                <w:szCs w:val="21"/>
               </w:rPr>
               <w:t>5</w:t>
             </w:r>
             <w:r>
               <w:rPr>
                 <w:rFonts w:ascii="Times New Roman" w:hAnsi="Times New Roman" w:cs="Times New Roman"/>
-                <w:sz w:val="24"/>
+                <w:szCs w:val="21"/>
               </w:rPr>
               <w:t>.is_pba %}</w:t>
             </w:r>
@@ -1619,42 +1627,42 @@
                 <w:rFonts w:ascii="Times New Roman" w:hAnsi="Times New Roman" w:cs="Times New Roman"/>
                 <w:b/>
                 <w:bCs/>
-                <w:sz w:val="24"/>
+                <w:szCs w:val="21"/>
               </w:rPr>
               <w:t>PBA:</w:t>
             </w:r>
             <w:r>
               <w:rPr>
                 <w:rFonts w:ascii="Times New Roman" w:hAnsi="Times New Roman" w:cs="Times New Roman"/>
-                <w:sz w:val="24"/>
+                <w:szCs w:val="21"/>
               </w:rPr>
               <w:t xml:space="preserve"> {% endif %}{{</w:t>
             </w:r>
             <w:r>
               <w:rPr>
                 <w:rFonts w:ascii="Times New Roman" w:hAnsi="Times New Roman" w:cs="Times New Roman"/>
-                <w:sz w:val="24"/>
+                <w:szCs w:val="21"/>
               </w:rPr>
               <w:t xml:space="preserve"> </w:t>
             </w:r>
             <w:r>
               <w:rPr>
                 <w:rFonts w:ascii="Times New Roman" w:hAnsi="Times New Roman" w:cs="Times New Roman"/>
-                <w:sz w:val="24"/>
+                <w:szCs w:val="21"/>
               </w:rPr>
               <w:t>session</w:t>
             </w:r>
             <w:r>
               <w:rPr>
                 <w:rFonts w:ascii="Times New Roman" w:hAnsi="Times New Roman" w:cs="Times New Roman"/>
-                <w:sz w:val="24"/>
+                <w:szCs w:val="21"/>
               </w:rPr>
               <w:t>5</w:t>
             </w:r>
             <w:r>
               <w:rPr>
                 <w:rFonts w:ascii="Times New Roman" w:hAnsi="Times New Roman" w:cs="Times New Roman"/>
-                <w:sz w:val="24"/>
+                <w:szCs w:val="21"/>
               </w:rPr>
               <w:t>.activity }}</w:t>
             </w:r>
@@ -1671,7 +1679,7 @@
               <w:ind w:left="0"/>
               <w:rPr>
                 <w:rFonts w:ascii="Times New Roman" w:hAnsi="Times New Roman" w:cs="Times New Roman"/>
-                <w:sz w:val="24"/>
+                <w:szCs w:val="21"/>
               </w:rPr>
             </w:pPr>
           </w:p>
@@ -1693,8 +1701,7 @@
             <w:pPr>
               <w:rPr>
                 <w:rFonts w:ascii="Times New Roman" w:hAnsi="Times New Roman" w:cs="Times New Roman"/>
-                <w:sz w:val="2"/>
-                <w:szCs w:val="2"/>
+                <w:szCs w:val="21"/>
               </w:rPr>
             </w:pPr>
           </w:p>
@@ -1711,14 +1718,14 @@
               <w:ind w:left="72"/>
               <w:rPr>
                 <w:rFonts w:ascii="Times New Roman" w:hAnsi="Times New Roman" w:cs="Times New Roman"/>
-                <w:sz w:val="24"/>
+                <w:szCs w:val="21"/>
               </w:rPr>
             </w:pPr>
             <w:r>
               <w:rPr>
                 <w:rFonts w:ascii="Times New Roman" w:hAnsi="Times New Roman" w:cs="Times New Roman"/>
                 <w:spacing w:val="-5"/>
-                <w:sz w:val="24"/>
+                <w:szCs w:val="21"/>
               </w:rPr>
               <w:t>{% if session</w:t>
             </w:r>
@@ -1726,7 +1733,7 @@
               <w:rPr>
                 <w:rFonts w:ascii="Times New Roman" w:hAnsi="Times New Roman" w:cs="Times New Roman"/>
                 <w:spacing w:val="-5"/>
-                <w:sz w:val="24"/>
+                <w:szCs w:val="21"/>
               </w:rPr>
               <w:t>5</w:t>
             </w:r>
@@ -1734,7 +1741,7 @@
               <w:rPr>
                 <w:rFonts w:ascii="Times New Roman" w:hAnsi="Times New Roman" w:cs="Times New Roman"/>
                 <w:spacing w:val="-5"/>
-                <w:sz w:val="24"/>
+                <w:szCs w:val="21"/>
               </w:rPr>
               <w:t>.has_pba %}{% else %}N/A{% endif %}</w:t>
             </w:r>
@@ -1870,15 +1877,15 @@
                 <w:rFonts w:ascii="Times New Roman" w:hAnsi="Times New Roman" w:cs="Times New Roman"/>
                 <w:b/>
                 <w:bCs/>
-                <w:sz w:val="24"/>
-              </w:rPr>
-            </w:pPr>
-            <w:r>
-              <w:rPr>
-                <w:rFonts w:ascii="Times New Roman" w:hAnsi="Times New Roman" w:cs="Times New Roman"/>
-                <w:b/>
-                <w:bCs/>
-                <w:sz w:val="24"/>
+                <w:szCs w:val="21"/>
+              </w:rPr>
+            </w:pPr>
+            <w:r>
+              <w:rPr>
+                <w:rFonts w:ascii="Times New Roman" w:hAnsi="Times New Roman" w:cs="Times New Roman"/>
+                <w:b/>
+                <w:bCs/>
+                <w:szCs w:val="21"/>
               </w:rPr>
               <w:t xml:space="preserve">Test </w:t>
             </w:r>
@@ -1888,7 +1895,7 @@
                 <w:b/>
                 <w:bCs/>
                 <w:spacing w:val="-2"/>
-                <w:sz w:val="24"/>
+                <w:szCs w:val="21"/>
               </w:rPr>
               <w:t>Review</w:t>
             </w:r>
@@ -1899,27 +1906,27 @@
               <w:spacing w:before="0" w:line="306" w:lineRule="exact"/>
               <w:rPr>
                 <w:rFonts w:ascii="Times New Roman" w:hAnsi="Times New Roman" w:cs="Times New Roman"/>
-                <w:sz w:val="24"/>
-              </w:rPr>
-            </w:pPr>
-            <w:r>
-              <w:rPr>
-                <w:rFonts w:ascii="Times New Roman" w:hAnsi="Times New Roman" w:cs="Times New Roman"/>
-                <w:sz w:val="24"/>
+                <w:szCs w:val="21"/>
+              </w:rPr>
+            </w:pPr>
+            <w:r>
+              <w:rPr>
+                <w:rFonts w:ascii="Times New Roman" w:hAnsi="Times New Roman" w:cs="Times New Roman"/>
+                <w:szCs w:val="21"/>
               </w:rPr>
               <w:t>{% if session</w:t>
             </w:r>
             <w:r>
               <w:rPr>
                 <w:rFonts w:ascii="Times New Roman" w:hAnsi="Times New Roman" w:cs="Times New Roman"/>
-                <w:sz w:val="24"/>
+                <w:szCs w:val="21"/>
               </w:rPr>
               <w:t>6</w:t>
             </w:r>
             <w:r>
               <w:rPr>
                 <w:rFonts w:ascii="Times New Roman" w:hAnsi="Times New Roman" w:cs="Times New Roman"/>
-                <w:sz w:val="24"/>
+                <w:szCs w:val="21"/>
               </w:rPr>
               <w:t>.is_pba %}</w:t>
             </w:r>
@@ -1928,28 +1935,28 @@
                 <w:rFonts w:ascii="Times New Roman" w:hAnsi="Times New Roman" w:cs="Times New Roman"/>
                 <w:b/>
                 <w:bCs/>
-                <w:sz w:val="24"/>
+                <w:szCs w:val="21"/>
               </w:rPr>
               <w:t>PBA:</w:t>
             </w:r>
             <w:r>
               <w:rPr>
                 <w:rFonts w:ascii="Times New Roman" w:hAnsi="Times New Roman" w:cs="Times New Roman"/>
-                <w:sz w:val="24"/>
+                <w:szCs w:val="21"/>
               </w:rPr>
               <w:t xml:space="preserve"> {% endif %}{{session</w:t>
             </w:r>
             <w:r>
               <w:rPr>
                 <w:rFonts w:ascii="Times New Roman" w:hAnsi="Times New Roman" w:cs="Times New Roman"/>
-                <w:sz w:val="24"/>
+                <w:szCs w:val="21"/>
               </w:rPr>
               <w:t>6</w:t>
             </w:r>
             <w:r>
               <w:rPr>
                 <w:rFonts w:ascii="Times New Roman" w:hAnsi="Times New Roman" w:cs="Times New Roman"/>
-                <w:sz w:val="24"/>
+                <w:szCs w:val="21"/>
               </w:rPr>
               <w:t>.activity }}</w:t>
             </w:r>
@@ -1966,7 +1973,7 @@
               <w:ind w:left="0"/>
               <w:rPr>
                 <w:rFonts w:ascii="Times New Roman" w:hAnsi="Times New Roman" w:cs="Times New Roman"/>
-                <w:sz w:val="24"/>
+                <w:szCs w:val="21"/>
               </w:rPr>
             </w:pPr>
           </w:p>
@@ -1988,8 +1995,7 @@
             <w:pPr>
               <w:rPr>
                 <w:rFonts w:ascii="Times New Roman" w:hAnsi="Times New Roman" w:cs="Times New Roman"/>
-                <w:sz w:val="2"/>
-                <w:szCs w:val="2"/>
+                <w:szCs w:val="21"/>
               </w:rPr>
             </w:pPr>
           </w:p>
@@ -2005,14 +2011,14 @@
               <w:spacing w:line="306" w:lineRule="exact"/>
               <w:rPr>
                 <w:rFonts w:ascii="Times New Roman" w:hAnsi="Times New Roman" w:cs="Times New Roman"/>
-                <w:sz w:val="24"/>
+                <w:szCs w:val="21"/>
               </w:rPr>
             </w:pPr>
             <w:r>
               <w:rPr>
                 <w:rFonts w:ascii="Times New Roman" w:hAnsi="Times New Roman" w:cs="Times New Roman"/>
                 <w:spacing w:val="-5"/>
-                <w:sz w:val="24"/>
+                <w:szCs w:val="21"/>
               </w:rPr>
               <w:t>{% if session</w:t>
             </w:r>
@@ -2020,7 +2026,7 @@
               <w:rPr>
                 <w:rFonts w:ascii="Times New Roman" w:hAnsi="Times New Roman" w:cs="Times New Roman"/>
                 <w:spacing w:val="-5"/>
-                <w:sz w:val="24"/>
+                <w:szCs w:val="21"/>
               </w:rPr>
               <w:t>6</w:t>
             </w:r>
@@ -2028,7 +2034,7 @@
               <w:rPr>
                 <w:rFonts w:ascii="Times New Roman" w:hAnsi="Times New Roman" w:cs="Times New Roman"/>
                 <w:spacing w:val="-5"/>
-                <w:sz w:val="24"/>
+                <w:szCs w:val="21"/>
               </w:rPr>
               <w:t>.has_pba %}{% else %}N/A{% endif %}</w:t>
             </w:r>
@@ -2164,15 +2170,15 @@
                 <w:rFonts w:ascii="Times New Roman" w:hAnsi="Times New Roman" w:cs="Times New Roman"/>
                 <w:b/>
                 <w:bCs/>
-                <w:sz w:val="24"/>
-              </w:rPr>
-            </w:pPr>
-            <w:r>
-              <w:rPr>
-                <w:rFonts w:ascii="Times New Roman" w:hAnsi="Times New Roman" w:cs="Times New Roman"/>
-                <w:b/>
-                <w:bCs/>
-                <w:sz w:val="24"/>
+                <w:szCs w:val="21"/>
+              </w:rPr>
+            </w:pPr>
+            <w:r>
+              <w:rPr>
+                <w:rFonts w:ascii="Times New Roman" w:hAnsi="Times New Roman" w:cs="Times New Roman"/>
+                <w:b/>
+                <w:bCs/>
+                <w:szCs w:val="21"/>
               </w:rPr>
               <w:t xml:space="preserve">Post </w:t>
             </w:r>
@@ -2182,7 +2188,7 @@
                 <w:b/>
                 <w:bCs/>
                 <w:spacing w:val="-4"/>
-                <w:sz w:val="24"/>
+                <w:szCs w:val="21"/>
               </w:rPr>
               <w:t>Test</w:t>
             </w:r>
@@ -2193,27 +2199,27 @@
               <w:spacing w:before="0" w:line="306" w:lineRule="exact"/>
               <w:rPr>
                 <w:rFonts w:ascii="Times New Roman" w:hAnsi="Times New Roman" w:cs="Times New Roman"/>
-                <w:sz w:val="24"/>
-              </w:rPr>
-            </w:pPr>
-            <w:r>
-              <w:rPr>
-                <w:rFonts w:ascii="Times New Roman" w:hAnsi="Times New Roman" w:cs="Times New Roman"/>
-                <w:sz w:val="24"/>
+                <w:szCs w:val="21"/>
+              </w:rPr>
+            </w:pPr>
+            <w:r>
+              <w:rPr>
+                <w:rFonts w:ascii="Times New Roman" w:hAnsi="Times New Roman" w:cs="Times New Roman"/>
+                <w:szCs w:val="21"/>
               </w:rPr>
               <w:t>{% if session</w:t>
             </w:r>
             <w:r>
               <w:rPr>
                 <w:rFonts w:ascii="Times New Roman" w:hAnsi="Times New Roman" w:cs="Times New Roman"/>
-                <w:sz w:val="24"/>
+                <w:szCs w:val="21"/>
               </w:rPr>
               <w:t>7</w:t>
             </w:r>
             <w:r>
               <w:rPr>
                 <w:rFonts w:ascii="Times New Roman" w:hAnsi="Times New Roman" w:cs="Times New Roman"/>
-                <w:sz w:val="24"/>
+                <w:szCs w:val="21"/>
               </w:rPr>
               <w:t>.is_pba %}</w:t>
             </w:r>
@@ -2222,42 +2228,42 @@
                 <w:rFonts w:ascii="Times New Roman" w:hAnsi="Times New Roman" w:cs="Times New Roman"/>
                 <w:b/>
                 <w:bCs/>
-                <w:sz w:val="24"/>
+                <w:szCs w:val="21"/>
               </w:rPr>
               <w:t>PBA:</w:t>
             </w:r>
             <w:r>
               <w:rPr>
                 <w:rFonts w:ascii="Times New Roman" w:hAnsi="Times New Roman" w:cs="Times New Roman"/>
-                <w:sz w:val="24"/>
+                <w:szCs w:val="21"/>
               </w:rPr>
               <w:t xml:space="preserve"> {% endif %}{{</w:t>
             </w:r>
             <w:r>
               <w:rPr>
                 <w:rFonts w:ascii="Times New Roman" w:hAnsi="Times New Roman" w:cs="Times New Roman"/>
-                <w:sz w:val="24"/>
+                <w:szCs w:val="21"/>
               </w:rPr>
               <w:t xml:space="preserve"> </w:t>
             </w:r>
             <w:r>
               <w:rPr>
                 <w:rFonts w:ascii="Times New Roman" w:hAnsi="Times New Roman" w:cs="Times New Roman"/>
-                <w:sz w:val="24"/>
+                <w:szCs w:val="21"/>
               </w:rPr>
               <w:t>session</w:t>
             </w:r>
             <w:r>
               <w:rPr>
                 <w:rFonts w:ascii="Times New Roman" w:hAnsi="Times New Roman" w:cs="Times New Roman"/>
-                <w:sz w:val="24"/>
+                <w:szCs w:val="21"/>
               </w:rPr>
               <w:t>7</w:t>
             </w:r>
             <w:r>
               <w:rPr>
                 <w:rFonts w:ascii="Times New Roman" w:hAnsi="Times New Roman" w:cs="Times New Roman"/>
-                <w:sz w:val="24"/>
+                <w:szCs w:val="21"/>
               </w:rPr>
               <w:t>.activity }}</w:t>
             </w:r>
@@ -2274,7 +2280,7 @@
               <w:ind w:left="0"/>
               <w:rPr>
                 <w:rFonts w:ascii="Times New Roman" w:hAnsi="Times New Roman" w:cs="Times New Roman"/>
-                <w:sz w:val="24"/>
+                <w:szCs w:val="21"/>
               </w:rPr>
             </w:pPr>
           </w:p>
@@ -2296,8 +2302,7 @@
             <w:pPr>
               <w:rPr>
                 <w:rFonts w:ascii="Times New Roman" w:hAnsi="Times New Roman" w:cs="Times New Roman"/>
-                <w:sz w:val="2"/>
-                <w:szCs w:val="2"/>
+                <w:szCs w:val="21"/>
               </w:rPr>
             </w:pPr>
           </w:p>
@@ -2313,14 +2318,14 @@
               <w:spacing w:line="306" w:lineRule="exact"/>
               <w:rPr>
                 <w:rFonts w:ascii="Times New Roman" w:hAnsi="Times New Roman" w:cs="Times New Roman"/>
-                <w:sz w:val="24"/>
+                <w:szCs w:val="21"/>
               </w:rPr>
             </w:pPr>
             <w:r>
               <w:rPr>
                 <w:rFonts w:ascii="Times New Roman" w:hAnsi="Times New Roman" w:cs="Times New Roman"/>
                 <w:spacing w:val="-5"/>
-                <w:sz w:val="24"/>
+                <w:szCs w:val="21"/>
               </w:rPr>
               <w:t>{% if session</w:t>
             </w:r>
@@ -2328,7 +2333,7 @@
               <w:rPr>
                 <w:rFonts w:ascii="Times New Roman" w:hAnsi="Times New Roman" w:cs="Times New Roman"/>
                 <w:spacing w:val="-5"/>
-                <w:sz w:val="24"/>
+                <w:szCs w:val="21"/>
               </w:rPr>
               <w:t>7</w:t>
             </w:r>
@@ -2336,7 +2341,7 @@
               <w:rPr>
                 <w:rFonts w:ascii="Times New Roman" w:hAnsi="Times New Roman" w:cs="Times New Roman"/>
                 <w:spacing w:val="-5"/>
-                <w:sz w:val="24"/>
+                <w:szCs w:val="21"/>
               </w:rPr>
               <w:t>.has_pba %}{% else %}N/A{% endif %}</w:t>
             </w:r>

</xml_diff>